<commit_message>
Classical ML only: XGBoost + PCA replaces the CNN in stage 1 (bundle v6); CNN kept as a comparison
- features/compute_stamp_features.py (29 features), models/train_realbogus_trees.py + predict_realbogus_trees.py (PCA + XGBoost)
- bundles can hold the classical model; predict_realbogus scores with either; live viewer defaults to v6
- scripts: compare_realbogus_models.py (LR, SVM, forest, XGBoost, CNN; k-means junk clusters), train_classical_bundle.py, evaluate_bundle.py
- v6 ties v4 on the scoreboard (test 40/44 known, depth 21.28 vs 21.34); stage-1 AP 0.902 vs CNN 0.898
- docs, Paras's materials, diagrams, web app (trees run in the browser) and Word reports updated; 171 tests pass
</commit_message>
<xml_diff>
--- a/01_Advik/06_Report_Advik.docx
+++ b/01_Advik/06_Report_Advik.docx
@@ -445,6 +445,24 @@
           <w:bCs/>
         </w:rPr>
         <w:t xml:space="preserve">Test bigger ideas fairly</w:t>
+      </w:r>
+    </w:p>
+    <w:p>
+      <w:pPr>
+        <w:pStyle w:val="ListParagraph"/>
+        <w:numPr>
+          <w:ilvl w:val="0"/>
+          <w:numId w:val="3"/>
+        </w:numPr>
+        <w:spacing w:after="80" w:line="290"/>
+      </w:pPr>
+      <w:r>
+        <w:rPr>
+          <w:rFonts w:ascii="Arial" w:cs="Arial" w:eastAsia="Arial" w:hAnsi="Arial"/>
+          <w:b/>
+          <w:bCs/>
+        </w:rPr>
+        <w:t xml:space="preserve">Switch to classical ML only (v6)</w:t>
       </w:r>
     </w:p>
     <w:p>
@@ -1129,7 +1147,72 @@
                 <w:sz w:val="19"/>
                 <w:szCs w:val="19"/>
               </w:rPr>
-              <w:t xml:space="preserve">166</w:t>
+              <w:t xml:space="preserve">171</w:t>
+            </w:r>
+          </w:p>
+        </w:tc>
+      </w:tr>
+      <w:tr>
+        <w:trPr>
+          <w:cantSplit/>
+        </w:trPr>
+        <w:tc>
+          <w:tcPr>
+            <w:tcW w:type="dxa" w:w="4600"/>
+            <w:tcBorders>
+              <w:top w:val="single" w:color="D6D2C8" w:sz="4"/>
+              <w:left w:val="single" w:color="D6D2C8" w:sz="4"/>
+              <w:bottom w:val="single" w:color="D6D2C8" w:sz="4"/>
+              <w:right w:val="single" w:color="D6D2C8" w:sz="4"/>
+            </w:tcBorders>
+            <w:tcMar>
+              <w:top w:type="dxa" w:w="70"/>
+              <w:left w:type="dxa" w:w="110"/>
+              <w:bottom w:type="dxa" w:w="70"/>
+              <w:right w:type="dxa" w:w="110"/>
+            </w:tcMar>
+          </w:tcPr>
+          <w:p>
+            <w:pPr>
+              <w:spacing w:after="0" w:line="260"/>
+            </w:pPr>
+            <w:r>
+              <w:rPr>
+                <w:rFonts w:ascii="Arial" w:cs="Arial" w:eastAsia="Arial" w:hAnsi="Arial"/>
+                <w:sz w:val="19"/>
+                <w:szCs w:val="19"/>
+              </w:rPr>
+              <w:t xml:space="preserve">Classical v6 vs CNN v4 (whole pipeline)</w:t>
+            </w:r>
+          </w:p>
+        </w:tc>
+        <w:tc>
+          <w:tcPr>
+            <w:tcW w:type="dxa" w:w="5146"/>
+            <w:tcBorders>
+              <w:top w:val="single" w:color="D6D2C8" w:sz="4"/>
+              <w:left w:val="single" w:color="D6D2C8" w:sz="4"/>
+              <w:bottom w:val="single" w:color="D6D2C8" w:sz="4"/>
+              <w:right w:val="single" w:color="D6D2C8" w:sz="4"/>
+            </w:tcBorders>
+            <w:tcMar>
+              <w:top w:type="dxa" w:w="70"/>
+              <w:left w:type="dxa" w:w="110"/>
+              <w:bottom w:type="dxa" w:w="70"/>
+              <w:right w:type="dxa" w:w="110"/>
+            </w:tcMar>
+          </w:tcPr>
+          <w:p>
+            <w:pPr>
+              <w:spacing w:after="0" w:line="260"/>
+            </w:pPr>
+            <w:r>
+              <w:rPr>
+                <w:rFonts w:ascii="Arial" w:cs="Arial" w:eastAsia="Arial" w:hAnsi="Arial"/>
+                <w:sz w:val="19"/>
+                <w:szCs w:val="19"/>
+              </w:rPr>
+              <w:t xml:space="preserve">a tie: 40/44 known asteroids on test for both; depth 21.28 vs 21.34</w:t>
             </w:r>
           </w:p>
         </w:tc>
@@ -1180,7 +1263,7 @@
         <w:rPr>
           <w:rFonts w:ascii="Arial" w:cs="Arial" w:eastAsia="Arial" w:hAnsi="Arial"/>
         </w:rPr>
-        <w:t xml:space="preserve"> (labels and the CNN) → </w:t>
+        <w:t xml:space="preserve"> (labels and the classical ML model) → </w:t>
       </w:r>
       <w:r>
         <w:rPr>
@@ -1283,7 +1366,7 @@
         <w:rPr>
           <w:rFonts w:ascii="Arial" w:cs="Arial" w:eastAsia="Arial" w:hAnsi="Arial"/>
         </w:rPr>
-        <w:t xml:space="preserve">The one ML architecture at the centre of the project is the real/bogus CNN (00_Start_Here/00_How_Our_Model_Works.svg): it looks at three 31 x 31 pictures of a blob and gives the probability that it is a real moving object (average precision 0.899 on validation nights, 0.938 on the test night, against 0.780 for a simple model).</w:t>
+        <w:t xml:space="preserve">The ML model at the centre of the project is classical: XGBoost on 29 measured numbers plus 20 PCA numbers per blob (00_Start_Here/00_How_Our_Model_Works.svg). It looks at three 31 x 31 pictures of a blob and gives the probability that it is a real moving object (average precision 0.902 on validation nights, 0.938 on the test night, against 0.783 for the old baseline; the deep-learning CNN, kept only as a comparison, scored 0.898).</w:t>
       </w:r>
     </w:p>
     <w:p>
@@ -1375,7 +1458,7 @@
         <w:rPr>
           <w:rFonts w:ascii="Arial" w:cs="Arial" w:eastAsia="Arial" w:hAnsi="Arial"/>
         </w:rPr>
-        <w:t xml:space="preserve">Four stages with clear hand-overs (Aaryan → Paras → Satvik → me) and one deployed function, run_night_pipeline, used both for evaluation (with fakes) and for the real search (without), so what we test is what we deploy. Model versions are saved as bundles (CNN + track model + thresholds + provenance).</w:t>
+        <w:t xml:space="preserve">Four stages with clear hand-overs (Aaryan → Paras → Satvik → me) and one deployed function, run_night_pipeline, used both for evaluation (with fakes) and for the real search (without), so what we test is what we deploy. Model versions are saved as bundles (stage-1 model + track model + thresholds + provenance).</w:t>
       </w:r>
     </w:p>
     <w:p>
@@ -1584,7 +1667,7 @@
         <w:pStyle w:val="Heading3"/>
       </w:pPr>
       <w:r>
-        <w:t xml:space="preserve">Step 6. Build the deep search</w:t>
+        <w:t xml:space="preserve">Step 6. Switch to classical ML only (v6)</w:t>
       </w:r>
     </w:p>
     <w:p>
@@ -1595,7 +1678,7 @@
         <w:rPr>
           <w:rFonts w:ascii="Arial" w:cs="Arial" w:eastAsia="Arial" w:hAnsi="Arial"/>
         </w:rPr>
-        <w:t xml:space="preserve">Shift-and-stack over 4,888 trial motions on the GPU. Statistics: 6,179 false peaks per stack at 5σ but 44 at 6σ, so we use 6σ; a null test with shuffled times went from 16 false tracks to 0 after a velocity-consistency cut, keeping 20 of 20 known asteroids. Depth 22.1 vs 21.4.</w:t>
+        <w:t xml:space="preserve">Our faculty asked for classical ML. I built bundle v6, the v4 design with XGBoost on 29 features + PCA instead of the CNN, put it on the scoreboard, and re-ran v4 the same day as a check (its numbers reproduced exactly). v6 ties v4: the same known asteroids on every split (test 40/44), depth 21.28 vs 21.34. v6 is now the deployed system and the live viewer's default.</w:t>
       </w:r>
     </w:p>
     <w:p>
@@ -1620,7 +1703,7 @@
           <w:sz w:val="18"/>
           <w:szCs w:val="18"/>
         </w:rPr>
-        <w:t xml:space="preserve">deep/stack_and_find_peaks.py, configs/deep.yaml</w:t>
+        <w:t xml:space="preserve">scripts/train_classical_bundle.py, scripts/evaluate_bundle.py</w:t>
       </w:r>
     </w:p>
     <w:p>
@@ -1628,7 +1711,7 @@
         <w:pStyle w:val="Heading3"/>
       </w:pPr>
       <w:r>
-        <w:t xml:space="preserve">Step 7. Fast movers and the live monitor</w:t>
+        <w:t xml:space="preserve">Step 7. Build the deep search</w:t>
       </w:r>
     </w:p>
     <w:p>
@@ -1639,7 +1722,7 @@
         <w:rPr>
           <w:rFonts w:ascii="Arial" w:cs="Arial" w:eastAsia="Arial" w:hAnsi="Arial"/>
         </w:rPr>
-        <w:t xml:space="preserve">A trail-shaped filter finds fast near-Earth objects (97% of planted trails, 93% on a later night); the monitor watches the archive and runs every search on new nights.</w:t>
+        <w:t xml:space="preserve">Shift-and-stack over 4,888 trial motions on the GPU. Statistics: 6,179 false peaks per stack at 5σ but 44 at 6σ, so we use 6σ; a null test with shuffled times went from 16 false tracks to 0 after a velocity-consistency cut, keeping 20 of 20 known asteroids. Depth 22.1 vs 21.4.</w:t>
       </w:r>
     </w:p>
     <w:p>
@@ -1664,7 +1747,7 @@
           <w:sz w:val="18"/>
           <w:szCs w:val="18"/>
         </w:rPr>
-        <w:t xml:space="preserve">fast/, pipeline/run_live_monitor.py</w:t>
+        <w:t xml:space="preserve">deep/stack_and_find_peaks.py, configs/deep.yaml</w:t>
       </w:r>
     </w:p>
     <w:p>
@@ -1672,7 +1755,7 @@
         <w:pStyle w:val="Heading3"/>
       </w:pPr>
       <w:r>
-        <w:t xml:space="preserve">Step 8. Live viewer and web app</w:t>
+        <w:t xml:space="preserve">Step 8. Fast movers and the live monitor</w:t>
       </w:r>
     </w:p>
     <w:p>
@@ -1683,7 +1766,7 @@
         <w:rPr>
           <w:rFonts w:ascii="Arial" w:cs="Arial" w:eastAsia="Arial" w:hAnsi="Arial"/>
         </w:rPr>
-        <w:t xml:space="preserve">The live viewer runs the real functions stage by stage and draws each one. The web app (web/) shows the pipeline on a real window of the test night and runs the trained CNN in the browser.</w:t>
+        <w:t xml:space="preserve">A trail-shaped filter finds fast near-Earth objects (97% of planted trails, 93% on a later night); the monitor watches the archive and runs every search on new nights.</w:t>
       </w:r>
     </w:p>
     <w:p>
@@ -1708,6 +1791,50 @@
           <w:sz w:val="18"/>
           <w:szCs w:val="18"/>
         </w:rPr>
+        <w:t xml:space="preserve">fast/, pipeline/run_live_monitor.py</w:t>
+      </w:r>
+    </w:p>
+    <w:p>
+      <w:pPr>
+        <w:pStyle w:val="Heading3"/>
+      </w:pPr>
+      <w:r>
+        <w:t xml:space="preserve">Step 9. Live viewer and web app</w:t>
+      </w:r>
+    </w:p>
+    <w:p>
+      <w:pPr>
+        <w:spacing w:after="140" w:line="300"/>
+      </w:pPr>
+      <w:r>
+        <w:rPr>
+          <w:rFonts w:ascii="Arial" w:cs="Arial" w:eastAsia="Arial" w:hAnsi="Arial"/>
+        </w:rPr>
+        <w:t xml:space="preserve">The live viewer runs the real functions stage by stage and draws each one. The web app (web/) shows the pipeline on a real window of the test night and runs the deployed classical model (600 trees) in the browser.</w:t>
+      </w:r>
+    </w:p>
+    <w:p>
+      <w:pPr>
+        <w:spacing w:after="160"/>
+      </w:pPr>
+      <w:r>
+        <w:rPr>
+          <w:rFonts w:ascii="Arial" w:cs="Arial" w:eastAsia="Arial" w:hAnsi="Arial"/>
+          <w:b/>
+          <w:bCs/>
+          <w:color w:val="6B6A66"/>
+          <w:sz w:val="18"/>
+          <w:szCs w:val="18"/>
+        </w:rPr>
+        <w:t xml:space="preserve">Code / file: </w:t>
+      </w:r>
+      <w:r>
+        <w:rPr>
+          <w:rFonts w:ascii="Courier New" w:cs="Courier New" w:eastAsia="Courier New" w:hAnsi="Courier New"/>
+          <w:color w:val="6B6A66"/>
+          <w:sz w:val="18"/>
+          <w:szCs w:val="18"/>
+        </w:rPr>
         <w:t xml:space="preserve">scripts/live_viewer.py, web/</w:t>
       </w:r>
     </w:p>
@@ -1716,7 +1843,7 @@
         <w:pStyle w:val="Heading3"/>
       </w:pPr>
       <w:r>
-        <w:t xml:space="preserve">Step 9. Make it reproducible</w:t>
+        <w:t xml:space="preserve">Step 10. Make it reproducible</w:t>
       </w:r>
     </w:p>
     <w:p>
@@ -1727,7 +1854,7 @@
         <w:rPr>
           <w:rFonts w:ascii="Arial" w:cs="Arial" w:eastAsia="Arial" w:hAnsi="Arial"/>
         </w:rPr>
-        <w:t xml:space="preserve">Settings in config files, git commit in every model bundle, seeded random fakes, a pinned environment, and 166 offline tests (end-to-end, leakage, viewer equals pipeline).</w:t>
+        <w:t xml:space="preserve">Settings in config files, git commit in every model bundle, seeded random fakes, a pinned environment, and 171 offline tests (end-to-end, leakage, viewer equals pipeline).</w:t>
       </w:r>
     </w:p>
     <w:p>
@@ -2366,7 +2493,72 @@
                 <w:sz w:val="19"/>
                 <w:szCs w:val="19"/>
               </w:rPr>
-              <w:t xml:space="preserve">166</w:t>
+              <w:t xml:space="preserve">171</w:t>
+            </w:r>
+          </w:p>
+        </w:tc>
+      </w:tr>
+      <w:tr>
+        <w:trPr>
+          <w:cantSplit/>
+        </w:trPr>
+        <w:tc>
+          <w:tcPr>
+            <w:tcW w:type="dxa" w:w="4600"/>
+            <w:tcBorders>
+              <w:top w:val="single" w:color="D6D2C8" w:sz="4"/>
+              <w:left w:val="single" w:color="D6D2C8" w:sz="4"/>
+              <w:bottom w:val="single" w:color="D6D2C8" w:sz="4"/>
+              <w:right w:val="single" w:color="D6D2C8" w:sz="4"/>
+            </w:tcBorders>
+            <w:tcMar>
+              <w:top w:type="dxa" w:w="70"/>
+              <w:left w:type="dxa" w:w="110"/>
+              <w:bottom w:type="dxa" w:w="70"/>
+              <w:right w:type="dxa" w:w="110"/>
+            </w:tcMar>
+          </w:tcPr>
+          <w:p>
+            <w:pPr>
+              <w:spacing w:after="0" w:line="260"/>
+            </w:pPr>
+            <w:r>
+              <w:rPr>
+                <w:rFonts w:ascii="Arial" w:cs="Arial" w:eastAsia="Arial" w:hAnsi="Arial"/>
+                <w:sz w:val="19"/>
+                <w:szCs w:val="19"/>
+              </w:rPr>
+              <w:t xml:space="preserve">Classical v6 vs CNN v4 (whole pipeline)</w:t>
+            </w:r>
+          </w:p>
+        </w:tc>
+        <w:tc>
+          <w:tcPr>
+            <w:tcW w:type="dxa" w:w="5146"/>
+            <w:tcBorders>
+              <w:top w:val="single" w:color="D6D2C8" w:sz="4"/>
+              <w:left w:val="single" w:color="D6D2C8" w:sz="4"/>
+              <w:bottom w:val="single" w:color="D6D2C8" w:sz="4"/>
+              <w:right w:val="single" w:color="D6D2C8" w:sz="4"/>
+            </w:tcBorders>
+            <w:tcMar>
+              <w:top w:type="dxa" w:w="70"/>
+              <w:left w:type="dxa" w:w="110"/>
+              <w:bottom w:type="dxa" w:w="70"/>
+              <w:right w:type="dxa" w:w="110"/>
+            </w:tcMar>
+          </w:tcPr>
+          <w:p>
+            <w:pPr>
+              <w:spacing w:after="0" w:line="260"/>
+            </w:pPr>
+            <w:r>
+              <w:rPr>
+                <w:rFonts w:ascii="Arial" w:cs="Arial" w:eastAsia="Arial" w:hAnsi="Arial"/>
+                <w:sz w:val="19"/>
+                <w:szCs w:val="19"/>
+              </w:rPr>
+              <w:t xml:space="preserve">a tie: 40/44 known asteroids on test for both; depth 21.28 vs 21.34</w:t>
             </w:r>
           </w:p>
         </w:tc>
@@ -3315,7 +3507,7 @@
                 <w:sz w:val="19"/>
                 <w:szCs w:val="19"/>
               </w:rPr>
-              <w:t xml:space="preserve">v4</w:t>
+              <w:t xml:space="preserve">v4 (CNN)</w:t>
             </w:r>
           </w:p>
         </w:tc>
@@ -3835,7 +4027,7 @@
                 <w:sz w:val="19"/>
                 <w:szCs w:val="19"/>
               </w:rPr>
-              <w:t xml:space="preserve">validation</w:t>
+              <w:t xml:space="preserve">test</w:t>
             </w:r>
           </w:p>
         </w:tc>
@@ -3865,7 +4057,7 @@
                 <w:sz w:val="19"/>
                 <w:szCs w:val="19"/>
               </w:rPr>
-              <w:t xml:space="preserve">v1</w:t>
+              <w:t xml:space="preserve">v6 (classical, deployed)</w:t>
             </w:r>
           </w:p>
         </w:tc>
@@ -3895,7 +4087,7 @@
                 <w:sz w:val="19"/>
                 <w:szCs w:val="19"/>
               </w:rPr>
-              <w:t xml:space="preserve">0.919</w:t>
+              <w:t xml:space="preserve">0.934</w:t>
             </w:r>
           </w:p>
         </w:tc>
@@ -3925,7 +4117,7 @@
                 <w:sz w:val="19"/>
                 <w:szCs w:val="19"/>
               </w:rPr>
-              <w:t xml:space="preserve">96.0%</w:t>
+              <w:t xml:space="preserve">98.7%</w:t>
             </w:r>
           </w:p>
         </w:tc>
@@ -3955,7 +4147,7 @@
                 <w:sz w:val="19"/>
                 <w:szCs w:val="19"/>
               </w:rPr>
-              <w:t xml:space="preserve">1,184</w:t>
+              <w:t xml:space="preserve">3,568</w:t>
             </w:r>
           </w:p>
         </w:tc>
@@ -3985,7 +4177,7 @@
                 <w:sz w:val="19"/>
                 <w:szCs w:val="19"/>
               </w:rPr>
-              <w:t xml:space="preserve">1.000</w:t>
+              <w:t xml:space="preserve">0.994</w:t>
             </w:r>
           </w:p>
         </w:tc>
@@ -4015,7 +4207,7 @@
                 <w:sz w:val="19"/>
                 <w:szCs w:val="19"/>
               </w:rPr>
-              <w:t xml:space="preserve">20.18</w:t>
+              <w:t xml:space="preserve">21.28</w:t>
             </w:r>
           </w:p>
         </w:tc>
@@ -4045,7 +4237,7 @@
                 <w:sz w:val="19"/>
                 <w:szCs w:val="19"/>
               </w:rPr>
-              <w:t xml:space="preserve">21/28</w:t>
+              <w:t xml:space="preserve">40/44</w:t>
             </w:r>
           </w:p>
         </w:tc>
@@ -4075,7 +4267,7 @@
                 <w:sz w:val="19"/>
                 <w:szCs w:val="19"/>
               </w:rPr>
-              <w:t xml:space="preserve">0.0</w:t>
+              <w:t xml:space="preserve">6.3</w:t>
             </w:r>
           </w:p>
         </w:tc>
@@ -4140,7 +4332,7 @@
                 <w:sz w:val="19"/>
                 <w:szCs w:val="19"/>
               </w:rPr>
-              <w:t xml:space="preserve">v4</w:t>
+              <w:t xml:space="preserve">v1</w:t>
             </w:r>
           </w:p>
         </w:tc>
@@ -4200,7 +4392,7 @@
                 <w:sz w:val="19"/>
                 <w:szCs w:val="19"/>
               </w:rPr>
-              <w:t xml:space="preserve">99.2%</w:t>
+              <w:t xml:space="preserve">96.0%</w:t>
             </w:r>
           </w:p>
         </w:tc>
@@ -4230,7 +4422,7 @@
                 <w:sz w:val="19"/>
                 <w:szCs w:val="19"/>
               </w:rPr>
-              <w:t xml:space="preserve">3,901</w:t>
+              <w:t xml:space="preserve">1,184</w:t>
             </w:r>
           </w:p>
         </w:tc>
@@ -4260,7 +4452,7 @@
                 <w:sz w:val="19"/>
                 <w:szCs w:val="19"/>
               </w:rPr>
-              <w:t xml:space="preserve">0.998</w:t>
+              <w:t xml:space="preserve">1.000</w:t>
             </w:r>
           </w:p>
         </w:tc>
@@ -4290,7 +4482,7 @@
                 <w:sz w:val="19"/>
                 <w:szCs w:val="19"/>
               </w:rPr>
-              <w:t xml:space="preserve">20.49</w:t>
+              <w:t xml:space="preserve">20.18</w:t>
             </w:r>
           </w:p>
         </w:tc>
@@ -4320,7 +4512,7 @@
                 <w:sz w:val="19"/>
                 <w:szCs w:val="19"/>
               </w:rPr>
-              <w:t xml:space="preserve">24/28</w:t>
+              <w:t xml:space="preserve">21/28</w:t>
             </w:r>
           </w:p>
         </w:tc>
@@ -4385,7 +4577,7 @@
                 <w:sz w:val="19"/>
                 <w:szCs w:val="19"/>
               </w:rPr>
-              <w:t xml:space="preserve">holdout</w:t>
+              <w:t xml:space="preserve">validation</w:t>
             </w:r>
           </w:p>
         </w:tc>
@@ -4415,7 +4607,7 @@
                 <w:sz w:val="19"/>
                 <w:szCs w:val="19"/>
               </w:rPr>
-              <w:t xml:space="preserve">v1</w:t>
+              <w:t xml:space="preserve">v4 (CNN)</w:t>
             </w:r>
           </w:p>
         </w:tc>
@@ -4445,7 +4637,7 @@
                 <w:sz w:val="19"/>
                 <w:szCs w:val="19"/>
               </w:rPr>
-              <w:t xml:space="preserve">0.905</w:t>
+              <w:t xml:space="preserve">0.919</w:t>
             </w:r>
           </w:p>
         </w:tc>
@@ -4475,7 +4667,7 @@
                 <w:sz w:val="19"/>
                 <w:szCs w:val="19"/>
               </w:rPr>
-              <w:t xml:space="preserve">95.4%</w:t>
+              <w:t xml:space="preserve">99.2%</w:t>
             </w:r>
           </w:p>
         </w:tc>
@@ -4505,7 +4697,7 @@
                 <w:sz w:val="19"/>
                 <w:szCs w:val="19"/>
               </w:rPr>
-              <w:t xml:space="preserve">1,468</w:t>
+              <w:t xml:space="preserve">3,901</w:t>
             </w:r>
           </w:p>
         </w:tc>
@@ -4535,7 +4727,7 @@
                 <w:sz w:val="19"/>
                 <w:szCs w:val="19"/>
               </w:rPr>
-              <w:t xml:space="preserve">1.000</w:t>
+              <w:t xml:space="preserve">0.998</w:t>
             </w:r>
           </w:p>
         </w:tc>
@@ -4565,7 +4757,7 @@
                 <w:sz w:val="19"/>
                 <w:szCs w:val="19"/>
               </w:rPr>
-              <w:t xml:space="preserve">20.14</w:t>
+              <w:t xml:space="preserve">20.49</w:t>
             </w:r>
           </w:p>
         </w:tc>
@@ -4595,7 +4787,7 @@
                 <w:sz w:val="19"/>
                 <w:szCs w:val="19"/>
               </w:rPr>
-              <w:t xml:space="preserve">16/18</w:t>
+              <w:t xml:space="preserve">24/28</w:t>
             </w:r>
           </w:p>
         </w:tc>
@@ -4660,6 +4852,281 @@
                 <w:sz w:val="19"/>
                 <w:szCs w:val="19"/>
               </w:rPr>
+              <w:t xml:space="preserve">validation</w:t>
+            </w:r>
+          </w:p>
+        </w:tc>
+        <w:tc>
+          <w:tcPr>
+            <w:tcW w:type="dxa" w:w="850"/>
+            <w:tcBorders>
+              <w:top w:val="single" w:color="D6D2C8" w:sz="4"/>
+              <w:left w:val="single" w:color="D6D2C8" w:sz="4"/>
+              <w:bottom w:val="single" w:color="D6D2C8" w:sz="4"/>
+              <w:right w:val="single" w:color="D6D2C8" w:sz="4"/>
+            </w:tcBorders>
+            <w:tcMar>
+              <w:top w:type="dxa" w:w="70"/>
+              <w:left w:type="dxa" w:w="110"/>
+              <w:bottom w:type="dxa" w:w="70"/>
+              <w:right w:type="dxa" w:w="110"/>
+            </w:tcMar>
+          </w:tcPr>
+          <w:p>
+            <w:pPr>
+              <w:spacing w:after="0" w:line="260"/>
+            </w:pPr>
+            <w:r>
+              <w:rPr>
+                <w:rFonts w:ascii="Arial" w:cs="Arial" w:eastAsia="Arial" w:hAnsi="Arial"/>
+                <w:sz w:val="19"/>
+                <w:szCs w:val="19"/>
+              </w:rPr>
+              <w:t xml:space="preserve">v6 (classical, deployed)</w:t>
+            </w:r>
+          </w:p>
+        </w:tc>
+        <w:tc>
+          <w:tcPr>
+            <w:tcW w:type="dxa" w:w="900"/>
+            <w:tcBorders>
+              <w:top w:val="single" w:color="D6D2C8" w:sz="4"/>
+              <w:left w:val="single" w:color="D6D2C8" w:sz="4"/>
+              <w:bottom w:val="single" w:color="D6D2C8" w:sz="4"/>
+              <w:right w:val="single" w:color="D6D2C8" w:sz="4"/>
+            </w:tcBorders>
+            <w:tcMar>
+              <w:top w:type="dxa" w:w="70"/>
+              <w:left w:type="dxa" w:w="110"/>
+              <w:bottom w:type="dxa" w:w="70"/>
+              <w:right w:type="dxa" w:w="110"/>
+            </w:tcMar>
+          </w:tcPr>
+          <w:p>
+            <w:pPr>
+              <w:spacing w:after="0" w:line="260"/>
+            </w:pPr>
+            <w:r>
+              <w:rPr>
+                <w:rFonts w:ascii="Arial" w:cs="Arial" w:eastAsia="Arial" w:hAnsi="Arial"/>
+                <w:sz w:val="19"/>
+                <w:szCs w:val="19"/>
+              </w:rPr>
+              <w:t xml:space="preserve">0.921</w:t>
+            </w:r>
+          </w:p>
+        </w:tc>
+        <w:tc>
+          <w:tcPr>
+            <w:tcW w:type="dxa" w:w="1000"/>
+            <w:tcBorders>
+              <w:top w:val="single" w:color="D6D2C8" w:sz="4"/>
+              <w:left w:val="single" w:color="D6D2C8" w:sz="4"/>
+              <w:bottom w:val="single" w:color="D6D2C8" w:sz="4"/>
+              <w:right w:val="single" w:color="D6D2C8" w:sz="4"/>
+            </w:tcBorders>
+            <w:tcMar>
+              <w:top w:type="dxa" w:w="70"/>
+              <w:left w:type="dxa" w:w="110"/>
+              <w:bottom w:type="dxa" w:w="70"/>
+              <w:right w:type="dxa" w:w="110"/>
+            </w:tcMar>
+          </w:tcPr>
+          <w:p>
+            <w:pPr>
+              <w:spacing w:after="0" w:line="260"/>
+            </w:pPr>
+            <w:r>
+              <w:rPr>
+                <w:rFonts w:ascii="Arial" w:cs="Arial" w:eastAsia="Arial" w:hAnsi="Arial"/>
+                <w:sz w:val="19"/>
+                <w:szCs w:val="19"/>
+              </w:rPr>
+              <w:t xml:space="preserve">99.1%</w:t>
+            </w:r>
+          </w:p>
+        </w:tc>
+        <w:tc>
+          <w:tcPr>
+            <w:tcW w:type="dxa" w:w="1150"/>
+            <w:tcBorders>
+              <w:top w:val="single" w:color="D6D2C8" w:sz="4"/>
+              <w:left w:val="single" w:color="D6D2C8" w:sz="4"/>
+              <w:bottom w:val="single" w:color="D6D2C8" w:sz="4"/>
+              <w:right w:val="single" w:color="D6D2C8" w:sz="4"/>
+            </w:tcBorders>
+            <w:tcMar>
+              <w:top w:type="dxa" w:w="70"/>
+              <w:left w:type="dxa" w:w="110"/>
+              <w:bottom w:type="dxa" w:w="70"/>
+              <w:right w:type="dxa" w:w="110"/>
+            </w:tcMar>
+          </w:tcPr>
+          <w:p>
+            <w:pPr>
+              <w:spacing w:after="0" w:line="260"/>
+            </w:pPr>
+            <w:r>
+              <w:rPr>
+                <w:rFonts w:ascii="Arial" w:cs="Arial" w:eastAsia="Arial" w:hAnsi="Arial"/>
+                <w:sz w:val="19"/>
+                <w:szCs w:val="19"/>
+              </w:rPr>
+              <w:t xml:space="preserve">3,717</w:t>
+            </w:r>
+          </w:p>
+        </w:tc>
+        <w:tc>
+          <w:tcPr>
+            <w:tcW w:type="dxa" w:w="900"/>
+            <w:tcBorders>
+              <w:top w:val="single" w:color="D6D2C8" w:sz="4"/>
+              <w:left w:val="single" w:color="D6D2C8" w:sz="4"/>
+              <w:bottom w:val="single" w:color="D6D2C8" w:sz="4"/>
+              <w:right w:val="single" w:color="D6D2C8" w:sz="4"/>
+            </w:tcBorders>
+            <w:tcMar>
+              <w:top w:type="dxa" w:w="70"/>
+              <w:left w:type="dxa" w:w="110"/>
+              <w:bottom w:type="dxa" w:w="70"/>
+              <w:right w:type="dxa" w:w="110"/>
+            </w:tcMar>
+          </w:tcPr>
+          <w:p>
+            <w:pPr>
+              <w:spacing w:after="0" w:line="260"/>
+            </w:pPr>
+            <w:r>
+              <w:rPr>
+                <w:rFonts w:ascii="Arial" w:cs="Arial" w:eastAsia="Arial" w:hAnsi="Arial"/>
+                <w:sz w:val="19"/>
+                <w:szCs w:val="19"/>
+              </w:rPr>
+              <w:t xml:space="preserve">0.998</w:t>
+            </w:r>
+          </w:p>
+        </w:tc>
+        <w:tc>
+          <w:tcPr>
+            <w:tcW w:type="dxa" w:w="1050"/>
+            <w:tcBorders>
+              <w:top w:val="single" w:color="D6D2C8" w:sz="4"/>
+              <w:left w:val="single" w:color="D6D2C8" w:sz="4"/>
+              <w:bottom w:val="single" w:color="D6D2C8" w:sz="4"/>
+              <w:right w:val="single" w:color="D6D2C8" w:sz="4"/>
+            </w:tcBorders>
+            <w:tcMar>
+              <w:top w:type="dxa" w:w="70"/>
+              <w:left w:type="dxa" w:w="110"/>
+              <w:bottom w:type="dxa" w:w="70"/>
+              <w:right w:type="dxa" w:w="110"/>
+            </w:tcMar>
+          </w:tcPr>
+          <w:p>
+            <w:pPr>
+              <w:spacing w:after="0" w:line="260"/>
+            </w:pPr>
+            <w:r>
+              <w:rPr>
+                <w:rFonts w:ascii="Arial" w:cs="Arial" w:eastAsia="Arial" w:hAnsi="Arial"/>
+                <w:sz w:val="19"/>
+                <w:szCs w:val="19"/>
+              </w:rPr>
+              <w:t xml:space="preserve">20.48</w:t>
+            </w:r>
+          </w:p>
+        </w:tc>
+        <w:tc>
+          <w:tcPr>
+            <w:tcW w:type="dxa" w:w="1000"/>
+            <w:tcBorders>
+              <w:top w:val="single" w:color="D6D2C8" w:sz="4"/>
+              <w:left w:val="single" w:color="D6D2C8" w:sz="4"/>
+              <w:bottom w:val="single" w:color="D6D2C8" w:sz="4"/>
+              <w:right w:val="single" w:color="D6D2C8" w:sz="4"/>
+            </w:tcBorders>
+            <w:tcMar>
+              <w:top w:type="dxa" w:w="70"/>
+              <w:left w:type="dxa" w:w="110"/>
+              <w:bottom w:type="dxa" w:w="70"/>
+              <w:right w:type="dxa" w:w="110"/>
+            </w:tcMar>
+          </w:tcPr>
+          <w:p>
+            <w:pPr>
+              <w:spacing w:after="0" w:line="260"/>
+            </w:pPr>
+            <w:r>
+              <w:rPr>
+                <w:rFonts w:ascii="Arial" w:cs="Arial" w:eastAsia="Arial" w:hAnsi="Arial"/>
+                <w:sz w:val="19"/>
+                <w:szCs w:val="19"/>
+              </w:rPr>
+              <w:t xml:space="preserve">24/28</w:t>
+            </w:r>
+          </w:p>
+        </w:tc>
+        <w:tc>
+          <w:tcPr>
+            <w:tcW w:type="dxa" w:w="1196"/>
+            <w:tcBorders>
+              <w:top w:val="single" w:color="D6D2C8" w:sz="4"/>
+              <w:left w:val="single" w:color="D6D2C8" w:sz="4"/>
+              <w:bottom w:val="single" w:color="D6D2C8" w:sz="4"/>
+              <w:right w:val="single" w:color="D6D2C8" w:sz="4"/>
+            </w:tcBorders>
+            <w:tcMar>
+              <w:top w:type="dxa" w:w="70"/>
+              <w:left w:type="dxa" w:w="110"/>
+              <w:bottom w:type="dxa" w:w="70"/>
+              <w:right w:type="dxa" w:w="110"/>
+            </w:tcMar>
+          </w:tcPr>
+          <w:p>
+            <w:pPr>
+              <w:spacing w:after="0" w:line="260"/>
+            </w:pPr>
+            <w:r>
+              <w:rPr>
+                <w:rFonts w:ascii="Arial" w:cs="Arial" w:eastAsia="Arial" w:hAnsi="Arial"/>
+                <w:sz w:val="19"/>
+                <w:szCs w:val="19"/>
+              </w:rPr>
+              <w:t xml:space="preserve">0.0</w:t>
+            </w:r>
+          </w:p>
+        </w:tc>
+      </w:tr>
+      <w:tr>
+        <w:trPr>
+          <w:cantSplit/>
+        </w:trPr>
+        <w:tc>
+          <w:tcPr>
+            <w:tcW w:type="dxa" w:w="1150"/>
+            <w:tcBorders>
+              <w:top w:val="single" w:color="D6D2C8" w:sz="4"/>
+              <w:left w:val="single" w:color="D6D2C8" w:sz="4"/>
+              <w:bottom w:val="single" w:color="D6D2C8" w:sz="4"/>
+              <w:right w:val="single" w:color="D6D2C8" w:sz="4"/>
+            </w:tcBorders>
+            <w:tcMar>
+              <w:top w:type="dxa" w:w="70"/>
+              <w:left w:type="dxa" w:w="110"/>
+              <w:bottom w:type="dxa" w:w="70"/>
+              <w:right w:type="dxa" w:w="110"/>
+            </w:tcMar>
+          </w:tcPr>
+          <w:p>
+            <w:pPr>
+              <w:spacing w:after="0" w:line="260"/>
+            </w:pPr>
+            <w:r>
+              <w:rPr>
+                <w:rFonts w:ascii="Arial" w:cs="Arial" w:eastAsia="Arial" w:hAnsi="Arial"/>
+                <w:sz w:val="19"/>
+                <w:szCs w:val="19"/>
+              </w:rPr>
               <w:t xml:space="preserve">holdout</w:t>
             </w:r>
           </w:p>
@@ -4690,7 +5157,7 @@
                 <w:sz w:val="19"/>
                 <w:szCs w:val="19"/>
               </w:rPr>
-              <w:t xml:space="preserve">v4</w:t>
+              <w:t xml:space="preserve">v1</w:t>
             </w:r>
           </w:p>
         </w:tc>
@@ -4750,6 +5217,281 @@
                 <w:sz w:val="19"/>
                 <w:szCs w:val="19"/>
               </w:rPr>
+              <w:t xml:space="preserve">95.4%</w:t>
+            </w:r>
+          </w:p>
+        </w:tc>
+        <w:tc>
+          <w:tcPr>
+            <w:tcW w:type="dxa" w:w="1150"/>
+            <w:tcBorders>
+              <w:top w:val="single" w:color="D6D2C8" w:sz="4"/>
+              <w:left w:val="single" w:color="D6D2C8" w:sz="4"/>
+              <w:bottom w:val="single" w:color="D6D2C8" w:sz="4"/>
+              <w:right w:val="single" w:color="D6D2C8" w:sz="4"/>
+            </w:tcBorders>
+            <w:tcMar>
+              <w:top w:type="dxa" w:w="70"/>
+              <w:left w:type="dxa" w:w="110"/>
+              <w:bottom w:type="dxa" w:w="70"/>
+              <w:right w:type="dxa" w:w="110"/>
+            </w:tcMar>
+          </w:tcPr>
+          <w:p>
+            <w:pPr>
+              <w:spacing w:after="0" w:line="260"/>
+            </w:pPr>
+            <w:r>
+              <w:rPr>
+                <w:rFonts w:ascii="Arial" w:cs="Arial" w:eastAsia="Arial" w:hAnsi="Arial"/>
+                <w:sz w:val="19"/>
+                <w:szCs w:val="19"/>
+              </w:rPr>
+              <w:t xml:space="preserve">1,468</w:t>
+            </w:r>
+          </w:p>
+        </w:tc>
+        <w:tc>
+          <w:tcPr>
+            <w:tcW w:type="dxa" w:w="900"/>
+            <w:tcBorders>
+              <w:top w:val="single" w:color="D6D2C8" w:sz="4"/>
+              <w:left w:val="single" w:color="D6D2C8" w:sz="4"/>
+              <w:bottom w:val="single" w:color="D6D2C8" w:sz="4"/>
+              <w:right w:val="single" w:color="D6D2C8" w:sz="4"/>
+            </w:tcBorders>
+            <w:tcMar>
+              <w:top w:type="dxa" w:w="70"/>
+              <w:left w:type="dxa" w:w="110"/>
+              <w:bottom w:type="dxa" w:w="70"/>
+              <w:right w:type="dxa" w:w="110"/>
+            </w:tcMar>
+          </w:tcPr>
+          <w:p>
+            <w:pPr>
+              <w:spacing w:after="0" w:line="260"/>
+            </w:pPr>
+            <w:r>
+              <w:rPr>
+                <w:rFonts w:ascii="Arial" w:cs="Arial" w:eastAsia="Arial" w:hAnsi="Arial"/>
+                <w:sz w:val="19"/>
+                <w:szCs w:val="19"/>
+              </w:rPr>
+              <w:t xml:space="preserve">1.000</w:t>
+            </w:r>
+          </w:p>
+        </w:tc>
+        <w:tc>
+          <w:tcPr>
+            <w:tcW w:type="dxa" w:w="1050"/>
+            <w:tcBorders>
+              <w:top w:val="single" w:color="D6D2C8" w:sz="4"/>
+              <w:left w:val="single" w:color="D6D2C8" w:sz="4"/>
+              <w:bottom w:val="single" w:color="D6D2C8" w:sz="4"/>
+              <w:right w:val="single" w:color="D6D2C8" w:sz="4"/>
+            </w:tcBorders>
+            <w:tcMar>
+              <w:top w:type="dxa" w:w="70"/>
+              <w:left w:type="dxa" w:w="110"/>
+              <w:bottom w:type="dxa" w:w="70"/>
+              <w:right w:type="dxa" w:w="110"/>
+            </w:tcMar>
+          </w:tcPr>
+          <w:p>
+            <w:pPr>
+              <w:spacing w:after="0" w:line="260"/>
+            </w:pPr>
+            <w:r>
+              <w:rPr>
+                <w:rFonts w:ascii="Arial" w:cs="Arial" w:eastAsia="Arial" w:hAnsi="Arial"/>
+                <w:sz w:val="19"/>
+                <w:szCs w:val="19"/>
+              </w:rPr>
+              <w:t xml:space="preserve">20.14</w:t>
+            </w:r>
+          </w:p>
+        </w:tc>
+        <w:tc>
+          <w:tcPr>
+            <w:tcW w:type="dxa" w:w="1000"/>
+            <w:tcBorders>
+              <w:top w:val="single" w:color="D6D2C8" w:sz="4"/>
+              <w:left w:val="single" w:color="D6D2C8" w:sz="4"/>
+              <w:bottom w:val="single" w:color="D6D2C8" w:sz="4"/>
+              <w:right w:val="single" w:color="D6D2C8" w:sz="4"/>
+            </w:tcBorders>
+            <w:tcMar>
+              <w:top w:type="dxa" w:w="70"/>
+              <w:left w:type="dxa" w:w="110"/>
+              <w:bottom w:type="dxa" w:w="70"/>
+              <w:right w:type="dxa" w:w="110"/>
+            </w:tcMar>
+          </w:tcPr>
+          <w:p>
+            <w:pPr>
+              <w:spacing w:after="0" w:line="260"/>
+            </w:pPr>
+            <w:r>
+              <w:rPr>
+                <w:rFonts w:ascii="Arial" w:cs="Arial" w:eastAsia="Arial" w:hAnsi="Arial"/>
+                <w:sz w:val="19"/>
+                <w:szCs w:val="19"/>
+              </w:rPr>
+              <w:t xml:space="preserve">16/18</w:t>
+            </w:r>
+          </w:p>
+        </w:tc>
+        <w:tc>
+          <w:tcPr>
+            <w:tcW w:type="dxa" w:w="1196"/>
+            <w:tcBorders>
+              <w:top w:val="single" w:color="D6D2C8" w:sz="4"/>
+              <w:left w:val="single" w:color="D6D2C8" w:sz="4"/>
+              <w:bottom w:val="single" w:color="D6D2C8" w:sz="4"/>
+              <w:right w:val="single" w:color="D6D2C8" w:sz="4"/>
+            </w:tcBorders>
+            <w:tcMar>
+              <w:top w:type="dxa" w:w="70"/>
+              <w:left w:type="dxa" w:w="110"/>
+              <w:bottom w:type="dxa" w:w="70"/>
+              <w:right w:type="dxa" w:w="110"/>
+            </w:tcMar>
+          </w:tcPr>
+          <w:p>
+            <w:pPr>
+              <w:spacing w:after="0" w:line="260"/>
+            </w:pPr>
+            <w:r>
+              <w:rPr>
+                <w:rFonts w:ascii="Arial" w:cs="Arial" w:eastAsia="Arial" w:hAnsi="Arial"/>
+                <w:sz w:val="19"/>
+                <w:szCs w:val="19"/>
+              </w:rPr>
+              <w:t xml:space="preserve">0.0</w:t>
+            </w:r>
+          </w:p>
+        </w:tc>
+      </w:tr>
+      <w:tr>
+        <w:trPr>
+          <w:cantSplit/>
+        </w:trPr>
+        <w:tc>
+          <w:tcPr>
+            <w:tcW w:type="dxa" w:w="1150"/>
+            <w:tcBorders>
+              <w:top w:val="single" w:color="D6D2C8" w:sz="4"/>
+              <w:left w:val="single" w:color="D6D2C8" w:sz="4"/>
+              <w:bottom w:val="single" w:color="D6D2C8" w:sz="4"/>
+              <w:right w:val="single" w:color="D6D2C8" w:sz="4"/>
+            </w:tcBorders>
+            <w:tcMar>
+              <w:top w:type="dxa" w:w="70"/>
+              <w:left w:type="dxa" w:w="110"/>
+              <w:bottom w:type="dxa" w:w="70"/>
+              <w:right w:type="dxa" w:w="110"/>
+            </w:tcMar>
+          </w:tcPr>
+          <w:p>
+            <w:pPr>
+              <w:spacing w:after="0" w:line="260"/>
+            </w:pPr>
+            <w:r>
+              <w:rPr>
+                <w:rFonts w:ascii="Arial" w:cs="Arial" w:eastAsia="Arial" w:hAnsi="Arial"/>
+                <w:sz w:val="19"/>
+                <w:szCs w:val="19"/>
+              </w:rPr>
+              <w:t xml:space="preserve">holdout</w:t>
+            </w:r>
+          </w:p>
+        </w:tc>
+        <w:tc>
+          <w:tcPr>
+            <w:tcW w:type="dxa" w:w="850"/>
+            <w:tcBorders>
+              <w:top w:val="single" w:color="D6D2C8" w:sz="4"/>
+              <w:left w:val="single" w:color="D6D2C8" w:sz="4"/>
+              <w:bottom w:val="single" w:color="D6D2C8" w:sz="4"/>
+              <w:right w:val="single" w:color="D6D2C8" w:sz="4"/>
+            </w:tcBorders>
+            <w:tcMar>
+              <w:top w:type="dxa" w:w="70"/>
+              <w:left w:type="dxa" w:w="110"/>
+              <w:bottom w:type="dxa" w:w="70"/>
+              <w:right w:type="dxa" w:w="110"/>
+            </w:tcMar>
+          </w:tcPr>
+          <w:p>
+            <w:pPr>
+              <w:spacing w:after="0" w:line="260"/>
+            </w:pPr>
+            <w:r>
+              <w:rPr>
+                <w:rFonts w:ascii="Arial" w:cs="Arial" w:eastAsia="Arial" w:hAnsi="Arial"/>
+                <w:sz w:val="19"/>
+                <w:szCs w:val="19"/>
+              </w:rPr>
+              <w:t xml:space="preserve">v4 (CNN)</w:t>
+            </w:r>
+          </w:p>
+        </w:tc>
+        <w:tc>
+          <w:tcPr>
+            <w:tcW w:type="dxa" w:w="900"/>
+            <w:tcBorders>
+              <w:top w:val="single" w:color="D6D2C8" w:sz="4"/>
+              <w:left w:val="single" w:color="D6D2C8" w:sz="4"/>
+              <w:bottom w:val="single" w:color="D6D2C8" w:sz="4"/>
+              <w:right w:val="single" w:color="D6D2C8" w:sz="4"/>
+            </w:tcBorders>
+            <w:tcMar>
+              <w:top w:type="dxa" w:w="70"/>
+              <w:left w:type="dxa" w:w="110"/>
+              <w:bottom w:type="dxa" w:w="70"/>
+              <w:right w:type="dxa" w:w="110"/>
+            </w:tcMar>
+          </w:tcPr>
+          <w:p>
+            <w:pPr>
+              <w:spacing w:after="0" w:line="260"/>
+            </w:pPr>
+            <w:r>
+              <w:rPr>
+                <w:rFonts w:ascii="Arial" w:cs="Arial" w:eastAsia="Arial" w:hAnsi="Arial"/>
+                <w:sz w:val="19"/>
+                <w:szCs w:val="19"/>
+              </w:rPr>
+              <w:t xml:space="preserve">0.905</w:t>
+            </w:r>
+          </w:p>
+        </w:tc>
+        <w:tc>
+          <w:tcPr>
+            <w:tcW w:type="dxa" w:w="1000"/>
+            <w:tcBorders>
+              <w:top w:val="single" w:color="D6D2C8" w:sz="4"/>
+              <w:left w:val="single" w:color="D6D2C8" w:sz="4"/>
+              <w:bottom w:val="single" w:color="D6D2C8" w:sz="4"/>
+              <w:right w:val="single" w:color="D6D2C8" w:sz="4"/>
+            </w:tcBorders>
+            <w:tcMar>
+              <w:top w:type="dxa" w:w="70"/>
+              <w:left w:type="dxa" w:w="110"/>
+              <w:bottom w:type="dxa" w:w="70"/>
+              <w:right w:type="dxa" w:w="110"/>
+            </w:tcMar>
+          </w:tcPr>
+          <w:p>
+            <w:pPr>
+              <w:spacing w:after="0" w:line="260"/>
+            </w:pPr>
+            <w:r>
+              <w:rPr>
+                <w:rFonts w:ascii="Arial" w:cs="Arial" w:eastAsia="Arial" w:hAnsi="Arial"/>
+                <w:sz w:val="19"/>
+                <w:szCs w:val="19"/>
+              </w:rPr>
               <w:t xml:space="preserve">98.5%</w:t>
             </w:r>
           </w:p>
@@ -4841,6 +5583,281 @@
                 <w:szCs w:val="19"/>
               </w:rPr>
               <w:t xml:space="preserve">20.47</w:t>
+            </w:r>
+          </w:p>
+        </w:tc>
+        <w:tc>
+          <w:tcPr>
+            <w:tcW w:type="dxa" w:w="1000"/>
+            <w:tcBorders>
+              <w:top w:val="single" w:color="D6D2C8" w:sz="4"/>
+              <w:left w:val="single" w:color="D6D2C8" w:sz="4"/>
+              <w:bottom w:val="single" w:color="D6D2C8" w:sz="4"/>
+              <w:right w:val="single" w:color="D6D2C8" w:sz="4"/>
+            </w:tcBorders>
+            <w:tcMar>
+              <w:top w:type="dxa" w:w="70"/>
+              <w:left w:type="dxa" w:w="110"/>
+              <w:bottom w:type="dxa" w:w="70"/>
+              <w:right w:type="dxa" w:w="110"/>
+            </w:tcMar>
+          </w:tcPr>
+          <w:p>
+            <w:pPr>
+              <w:spacing w:after="0" w:line="260"/>
+            </w:pPr>
+            <w:r>
+              <w:rPr>
+                <w:rFonts w:ascii="Arial" w:cs="Arial" w:eastAsia="Arial" w:hAnsi="Arial"/>
+                <w:sz w:val="19"/>
+                <w:szCs w:val="19"/>
+              </w:rPr>
+              <w:t xml:space="preserve">17/18</w:t>
+            </w:r>
+          </w:p>
+        </w:tc>
+        <w:tc>
+          <w:tcPr>
+            <w:tcW w:type="dxa" w:w="1196"/>
+            <w:tcBorders>
+              <w:top w:val="single" w:color="D6D2C8" w:sz="4"/>
+              <w:left w:val="single" w:color="D6D2C8" w:sz="4"/>
+              <w:bottom w:val="single" w:color="D6D2C8" w:sz="4"/>
+              <w:right w:val="single" w:color="D6D2C8" w:sz="4"/>
+            </w:tcBorders>
+            <w:tcMar>
+              <w:top w:type="dxa" w:w="70"/>
+              <w:left w:type="dxa" w:w="110"/>
+              <w:bottom w:type="dxa" w:w="70"/>
+              <w:right w:type="dxa" w:w="110"/>
+            </w:tcMar>
+          </w:tcPr>
+          <w:p>
+            <w:pPr>
+              <w:spacing w:after="0" w:line="260"/>
+            </w:pPr>
+            <w:r>
+              <w:rPr>
+                <w:rFonts w:ascii="Arial" w:cs="Arial" w:eastAsia="Arial" w:hAnsi="Arial"/>
+                <w:sz w:val="19"/>
+                <w:szCs w:val="19"/>
+              </w:rPr>
+              <w:t xml:space="preserve">0.3</w:t>
+            </w:r>
+          </w:p>
+        </w:tc>
+      </w:tr>
+      <w:tr>
+        <w:trPr>
+          <w:cantSplit/>
+        </w:trPr>
+        <w:tc>
+          <w:tcPr>
+            <w:tcW w:type="dxa" w:w="1150"/>
+            <w:tcBorders>
+              <w:top w:val="single" w:color="D6D2C8" w:sz="4"/>
+              <w:left w:val="single" w:color="D6D2C8" w:sz="4"/>
+              <w:bottom w:val="single" w:color="D6D2C8" w:sz="4"/>
+              <w:right w:val="single" w:color="D6D2C8" w:sz="4"/>
+            </w:tcBorders>
+            <w:tcMar>
+              <w:top w:type="dxa" w:w="70"/>
+              <w:left w:type="dxa" w:w="110"/>
+              <w:bottom w:type="dxa" w:w="70"/>
+              <w:right w:type="dxa" w:w="110"/>
+            </w:tcMar>
+          </w:tcPr>
+          <w:p>
+            <w:pPr>
+              <w:spacing w:after="0" w:line="260"/>
+            </w:pPr>
+            <w:r>
+              <w:rPr>
+                <w:rFonts w:ascii="Arial" w:cs="Arial" w:eastAsia="Arial" w:hAnsi="Arial"/>
+                <w:sz w:val="19"/>
+                <w:szCs w:val="19"/>
+              </w:rPr>
+              <w:t xml:space="preserve">holdout</w:t>
+            </w:r>
+          </w:p>
+        </w:tc>
+        <w:tc>
+          <w:tcPr>
+            <w:tcW w:type="dxa" w:w="850"/>
+            <w:tcBorders>
+              <w:top w:val="single" w:color="D6D2C8" w:sz="4"/>
+              <w:left w:val="single" w:color="D6D2C8" w:sz="4"/>
+              <w:bottom w:val="single" w:color="D6D2C8" w:sz="4"/>
+              <w:right w:val="single" w:color="D6D2C8" w:sz="4"/>
+            </w:tcBorders>
+            <w:tcMar>
+              <w:top w:type="dxa" w:w="70"/>
+              <w:left w:type="dxa" w:w="110"/>
+              <w:bottom w:type="dxa" w:w="70"/>
+              <w:right w:type="dxa" w:w="110"/>
+            </w:tcMar>
+          </w:tcPr>
+          <w:p>
+            <w:pPr>
+              <w:spacing w:after="0" w:line="260"/>
+            </w:pPr>
+            <w:r>
+              <w:rPr>
+                <w:rFonts w:ascii="Arial" w:cs="Arial" w:eastAsia="Arial" w:hAnsi="Arial"/>
+                <w:sz w:val="19"/>
+                <w:szCs w:val="19"/>
+              </w:rPr>
+              <w:t xml:space="preserve">v6 (classical, deployed)</w:t>
+            </w:r>
+          </w:p>
+        </w:tc>
+        <w:tc>
+          <w:tcPr>
+            <w:tcW w:type="dxa" w:w="900"/>
+            <w:tcBorders>
+              <w:top w:val="single" w:color="D6D2C8" w:sz="4"/>
+              <w:left w:val="single" w:color="D6D2C8" w:sz="4"/>
+              <w:bottom w:val="single" w:color="D6D2C8" w:sz="4"/>
+              <w:right w:val="single" w:color="D6D2C8" w:sz="4"/>
+            </w:tcBorders>
+            <w:tcMar>
+              <w:top w:type="dxa" w:w="70"/>
+              <w:left w:type="dxa" w:w="110"/>
+              <w:bottom w:type="dxa" w:w="70"/>
+              <w:right w:type="dxa" w:w="110"/>
+            </w:tcMar>
+          </w:tcPr>
+          <w:p>
+            <w:pPr>
+              <w:spacing w:after="0" w:line="260"/>
+            </w:pPr>
+            <w:r>
+              <w:rPr>
+                <w:rFonts w:ascii="Arial" w:cs="Arial" w:eastAsia="Arial" w:hAnsi="Arial"/>
+                <w:sz w:val="19"/>
+                <w:szCs w:val="19"/>
+              </w:rPr>
+              <w:t xml:space="preserve">0.906</w:t>
+            </w:r>
+          </w:p>
+        </w:tc>
+        <w:tc>
+          <w:tcPr>
+            <w:tcW w:type="dxa" w:w="1000"/>
+            <w:tcBorders>
+              <w:top w:val="single" w:color="D6D2C8" w:sz="4"/>
+              <w:left w:val="single" w:color="D6D2C8" w:sz="4"/>
+              <w:bottom w:val="single" w:color="D6D2C8" w:sz="4"/>
+              <w:right w:val="single" w:color="D6D2C8" w:sz="4"/>
+            </w:tcBorders>
+            <w:tcMar>
+              <w:top w:type="dxa" w:w="70"/>
+              <w:left w:type="dxa" w:w="110"/>
+              <w:bottom w:type="dxa" w:w="70"/>
+              <w:right w:type="dxa" w:w="110"/>
+            </w:tcMar>
+          </w:tcPr>
+          <w:p>
+            <w:pPr>
+              <w:spacing w:after="0" w:line="260"/>
+            </w:pPr>
+            <w:r>
+              <w:rPr>
+                <w:rFonts w:ascii="Arial" w:cs="Arial" w:eastAsia="Arial" w:hAnsi="Arial"/>
+                <w:sz w:val="19"/>
+                <w:szCs w:val="19"/>
+              </w:rPr>
+              <w:t xml:space="preserve">98.7%</w:t>
+            </w:r>
+          </w:p>
+        </w:tc>
+        <w:tc>
+          <w:tcPr>
+            <w:tcW w:type="dxa" w:w="1150"/>
+            <w:tcBorders>
+              <w:top w:val="single" w:color="D6D2C8" w:sz="4"/>
+              <w:left w:val="single" w:color="D6D2C8" w:sz="4"/>
+              <w:bottom w:val="single" w:color="D6D2C8" w:sz="4"/>
+              <w:right w:val="single" w:color="D6D2C8" w:sz="4"/>
+            </w:tcBorders>
+            <w:tcMar>
+              <w:top w:type="dxa" w:w="70"/>
+              <w:left w:type="dxa" w:w="110"/>
+              <w:bottom w:type="dxa" w:w="70"/>
+              <w:right w:type="dxa" w:w="110"/>
+            </w:tcMar>
+          </w:tcPr>
+          <w:p>
+            <w:pPr>
+              <w:spacing w:after="0" w:line="260"/>
+            </w:pPr>
+            <w:r>
+              <w:rPr>
+                <w:rFonts w:ascii="Arial" w:cs="Arial" w:eastAsia="Arial" w:hAnsi="Arial"/>
+                <w:sz w:val="19"/>
+                <w:szCs w:val="19"/>
+              </w:rPr>
+              <w:t xml:space="preserve">4,708</w:t>
+            </w:r>
+          </w:p>
+        </w:tc>
+        <w:tc>
+          <w:tcPr>
+            <w:tcW w:type="dxa" w:w="900"/>
+            <w:tcBorders>
+              <w:top w:val="single" w:color="D6D2C8" w:sz="4"/>
+              <w:left w:val="single" w:color="D6D2C8" w:sz="4"/>
+              <w:bottom w:val="single" w:color="D6D2C8" w:sz="4"/>
+              <w:right w:val="single" w:color="D6D2C8" w:sz="4"/>
+            </w:tcBorders>
+            <w:tcMar>
+              <w:top w:type="dxa" w:w="70"/>
+              <w:left w:type="dxa" w:w="110"/>
+              <w:bottom w:type="dxa" w:w="70"/>
+              <w:right w:type="dxa" w:w="110"/>
+            </w:tcMar>
+          </w:tcPr>
+          <w:p>
+            <w:pPr>
+              <w:spacing w:after="0" w:line="260"/>
+            </w:pPr>
+            <w:r>
+              <w:rPr>
+                <w:rFonts w:ascii="Arial" w:cs="Arial" w:eastAsia="Arial" w:hAnsi="Arial"/>
+                <w:sz w:val="19"/>
+                <w:szCs w:val="19"/>
+              </w:rPr>
+              <w:t xml:space="preserve">0.997</w:t>
+            </w:r>
+          </w:p>
+        </w:tc>
+        <w:tc>
+          <w:tcPr>
+            <w:tcW w:type="dxa" w:w="1050"/>
+            <w:tcBorders>
+              <w:top w:val="single" w:color="D6D2C8" w:sz="4"/>
+              <w:left w:val="single" w:color="D6D2C8" w:sz="4"/>
+              <w:bottom w:val="single" w:color="D6D2C8" w:sz="4"/>
+              <w:right w:val="single" w:color="D6D2C8" w:sz="4"/>
+            </w:tcBorders>
+            <w:tcMar>
+              <w:top w:type="dxa" w:w="70"/>
+              <w:left w:type="dxa" w:w="110"/>
+              <w:bottom w:type="dxa" w:w="70"/>
+              <w:right w:type="dxa" w:w="110"/>
+            </w:tcMar>
+          </w:tcPr>
+          <w:p>
+            <w:pPr>
+              <w:spacing w:after="0" w:line="260"/>
+            </w:pPr>
+            <w:r>
+              <w:rPr>
+                <w:rFonts w:ascii="Arial" w:cs="Arial" w:eastAsia="Arial" w:hAnsi="Arial"/>
+                <w:sz w:val="19"/>
+                <w:szCs w:val="19"/>
+              </w:rPr>
+              <w:t xml:space="preserve">20.48</w:t>
             </w:r>
           </w:p>
         </w:tc>

</xml_diff>